<commit_message>
LD-02 第 9 章：raw 表须带 batch_seq
审 0003 时发现：隔离登记的键是 (run_id, batch_seq)，一次运行可含多个取数
窗口，只隔离不合格的那一个。staging 按批次过滤因此要求每张 raw 表都带
batch_seq。第 9 章原只列了 run_id，补上，并写明两列合起来是批次键。

Co-Authored-By: Claude Opus 5.5 <noreply@anthropic.com>
Claude-Session: https://claude.ai/code/session_01MzPePSHWkTUSpnMTsqY5pZ
</commit_message>
<xml_diff>
--- a/LD-02_数据模型详细设计.docx
+++ b/LD-02_数据模型详细设计.docx
@@ -2977,14 +2977,8 @@
             <w:pPr>
               <w:spacing w:after="40" w:before="40" w:line="283" w:lineRule="auto"/>
             </w:pPr>
-            <w:r/>
             <w:r>
-              <w:rPr>
-                <w:rFonts w:ascii="微软雅黑" w:hAnsi="微软雅黑" w:eastAsia="微软雅黑"/>
-                <w:b w:val="0"/>
-                <w:sz w:val="18"/>
-              </w:rPr>
-              <w:t>与源逐字一致，附完整原始载荷（JSONB）与接入元数据：run_id、contract_version、源水位、原始时区偏移、落地时间。只追加，永不覆盖、永不修正（DD-02）。一源一表，表名 raw.&lt;源标识&gt;__&lt;源表名&gt;。</w:t>
+              <w:t>与源逐字一致，附完整原始载荷（JSONB）与接入元数据：run_id、batch_seq、contract_version、源水位、原始时区偏移、落地时间。只追加，永不覆盖、永不修正（DD-02）。一源一表，表名 raw.&lt;源标识&gt;__&lt;源表名&gt;。 run_id 与 batch_seq 合起来标识一个取数批次，是隔离登记（meta.quarantine_batch，DD-76）与 staging 按批次过滤的键，故每张 raw 表都必须带这两列。</w:t>
             </w:r>
           </w:p>
         </w:tc>

</xml_diff>

<commit_message>
DD-96 fact_call 聚合规则与 call_result 四值（unanswered_system）；DD-97 注册表与 mart 对应、版本后缀；LD-03 2.4 与第 5 章补充；LD-02 第 10 章注；NOTES 第 8 步开工清单
Co-Authored-By: Claude Fable 5.1 <noreply@anthropic.com>
Claude-Session: https://claude.ai/code/session_01MzPePSHWkTUSpnMTsqY5pZ
</commit_message>
<xml_diff>
--- a/LD-02_数据模型详细设计.docx
+++ b/LD-02_数据模型详细设计.docx
@@ -3431,6 +3431,11 @@
     </w:tbl>
     <w:p/>
     <w:p>
+      <w:r>
+        <w:t>【2026-10-30 补充，DD-96 · DD-97】fact_call 增列 is_complete（末腿已到）；dim_call_result 取值改为 answered · abandoned · unanswered_system · ivr_only（结构变更）。话务 mart 第一组四张表与注册表对应规则见 LD-03 2.4 与第 5 章补充。</w:t>
+      </w:r>
+    </w:p>
+    <w:p>
       <w:pPr>
         <w:pStyle w:val="Heading1"/>
       </w:pPr>

</xml_diff>